<commit_message>
Add CSV/PDF exports and ultrasonic device support
Enable report exporting and add ultrasonic sensor support across the dashboard. ExportButton now emits click events; ReportsView implements CSV and printable PDF generation (with timestamped filenames and UI hooks). DeviceType now includes 'sensor_ultrasonico', DeviceFormModal adds the option, and mock devices updated with ultrasonic entries and firmware versions. HistoryView page size increased to 10. Added extensive documentation and ESP32 gate controller firmware/readme for integration and deployment.
</commit_message>
<xml_diff>
--- a/docs/Plan_Proyecto_Actividad_1_2 (2).docx
+++ b/docs/Plan_Proyecto_Actividad_1_2 (2).docx
@@ -13894,19 +13894,8 @@
             <w:vAlign w:val="center"/>
           </w:tcPr>
           <w:p>
-            <w:pPr>
-              <w:jc w:val="left"/>
-            </w:pPr>
-            <w:r>
-              <w:rPr>
-                <w:rFonts w:ascii="Arial" w:cs="Arial" w:eastAsia="Arial" w:hAnsi="Arial"/>
-                <w:b w:val="false"/>
-                <w:bCs w:val="false"/>
-                <w:color w:val="333333"/>
-                <w:sz w:val="20"/>
-                <w:szCs w:val="20"/>
-              </w:rPr>
-              <w:t xml:space="preserve">ESP32-CAM con sensor IR capturando patentes y enviando datos a Firebase.</w:t>
+            <w:r>
+              <w:t>ESP32-CAM con dos sensores ultras?nicos HC-SR04 en el mismo lado f?sico, capturando patentes y enviando datos a Firebase.</w:t>
             </w:r>
           </w:p>
         </w:tc>

</xml_diff>